<commit_message>
Strengthen six CVs with five-year role-depth evidence
Refreshes the explicitly selected CV-only batch and enforces distinct source-backed Experience bullets for roles ending within five years.
</commit_message>
<xml_diff>
--- a/registry/jobs/2026-09-14_180905_talmatic_senior-go-golang-software-engineer/application-codex/CV_ValentinNikolaev_talmatic_SeniorGoGolangSoftwareEngineer.docx
+++ b/registry/jobs/2026-09-14_180905_talmatic_senior-go-golang-software-engineer/application-codex/CV_ValentinNikolaev_talmatic_SeniorGoGolangSoftwareEngineer.docx
@@ -55,7 +55,7 @@
         </w:rPr>
         <w:t xml:space="preserve">Rome, Italy | </w:t>
       </w:r>
-      <w:hyperlink w:history="1" r:id="rIdjd-gcey3yt5yu-phrjugj">
+      <w:hyperlink w:history="1" r:id="rId9qs91vod2rtyzvvzrsliv">
         <w:r>
           <w:rPr>
             <w:rFonts w:ascii="Aptos" w:cs="Aptos" w:eastAsia="Aptos" w:hAnsi="Aptos"/>
@@ -99,7 +99,7 @@
         </w:rPr>
         <w:t xml:space="preserve">LinkedIn: </w:t>
       </w:r>
-      <w:hyperlink w:history="1" r:id="rId4k3dsycxl_u0qivprohbf">
+      <w:hyperlink w:history="1" r:id="rIdez2xuu7rn3nwnhlbt-hpn">
         <w:r>
           <w:rPr>
             <w:rFonts w:ascii="Aptos" w:cs="Aptos" w:eastAsia="Aptos" w:hAnsi="Aptos"/>
@@ -122,7 +122,7 @@
         </w:rPr>
         <w:t xml:space="preserve"> | GitHub: </w:t>
       </w:r>
-      <w:hyperlink w:history="1" r:id="rId9qcpwyg8wjczfg7jxno0h">
+      <w:hyperlink w:history="1" r:id="rIdp-squd5mc2wlz9qnhd8xn">
         <w:r>
           <w:rPr>
             <w:rFonts w:ascii="Aptos" w:cs="Aptos" w:eastAsia="Aptos" w:hAnsi="Aptos"/>
@@ -670,6 +670,27 @@
           <w:rtl w:val="false"/>
         </w:rPr>
         <w:t xml:space="preserve">Developed a Laravel/Symfony logger package aligned with the interservice communication standard, giving teams a shared logging implementation.</w:t>
+      </w:r>
+    </w:p>
+    <w:p>
+      <w:pPr>
+        <w:pStyle w:val="ListParagraph"/>
+        <w:numPr>
+          <w:ilvl w:val="0"/>
+          <w:numId w:val="1"/>
+        </w:numPr>
+        <w:bidi w:val="false"/>
+        <w:spacing w:after="60" w:before="60"/>
+      </w:pPr>
+      <w:r>
+        <w:rPr>
+          <w:rFonts w:ascii="Aptos" w:cs="Aptos" w:eastAsia="Aptos" w:hAnsi="Aptos"/>
+          <w:color w:val="000000"/>
+          <w:sz w:val="24"/>
+          <w:szCs w:val="24"/>
+          <w:rtl w:val="false"/>
+        </w:rPr>
+        <w:t xml:space="preserve">Led epic decomposition, task delegation, and release-backlog planning with the engineering team.</w:t>
       </w:r>
     </w:p>
     <w:p>

</xml_diff>